<commit_message>
Redesign engineer portfolio with verified equipment imagery and AI workflow
</commit_message>
<xml_diff>
--- a/assets/Henry_Yang_Biomedical_Engineer_Resume.docx
+++ b/assets/Henry_Yang_Biomedical_Engineer_Resume.docx
@@ -49,6 +49,7 @@
     </w:p>
     <w:p>
       <w:pPr>
+        <w:keepNext/>
         <w:spacing w:before="160" w:after="60"/>
       </w:pPr>
       <w:r>
@@ -73,11 +74,12 @@
           <w:i w:val="0"/>
           <w:sz w:val="18"/>
         </w:rPr>
-        <w:t>Nearly three years of field and workshop service experience at Nova Biomedical Australia with medical equipment used in hospital and pharmacy settings. Core strengths include preventive maintenance (PM), fault diagnosis, repair, installation support, verification, service documentation, and next-use or escalation records.</w:t>
+        <w:t>Three years of field and workshop service experience at Nova Biomedical Australia with medical equipment used in hospital and pharmacy settings. Core strengths include preventive maintenance (PM), fault diagnosis, repair, installation support, verification, service documentation, and return-to-use or escalation decisions.</w:t>
       </w:r>
     </w:p>
     <w:p>
       <w:pPr>
+        <w:keepNext/>
         <w:spacing w:before="160" w:after="60"/>
       </w:pPr>
       <w:r>
@@ -110,7 +112,7 @@
           <w:color w:val="525252"/>
           <w:sz w:val="18"/>
         </w:rPr>
-        <w:t xml:space="preserve"> | Australia-wide field service / workshop support | Jul 2023 - Present</w:t>
+        <w:t xml:space="preserve"> | Field service across Australia / workshop repair | Jul 2023 - Present</w:t>
       </w:r>
     </w:p>
     <w:p>
@@ -185,11 +187,12 @@
           <w:i w:val="0"/>
           <w:sz w:val="18"/>
         </w:rPr>
-        <w:t>Maintain Simpro work orders, service reports, equipment history, and communication notes so service records remain traceable service evidence.</w:t>
+        <w:t>Maintain Simpro work orders, service reports, equipment history, and communication notes as a traceable service history.</w:t>
       </w:r>
     </w:p>
     <w:p>
       <w:pPr>
+        <w:keepNext/>
         <w:spacing w:before="160" w:after="60"/>
       </w:pPr>
       <w:r>
@@ -265,6 +268,7 @@
     </w:p>
     <w:p>
       <w:pPr>
+        <w:keepNext/>
         <w:spacing w:before="160" w:after="60"/>
       </w:pPr>
       <w:r>
@@ -325,6 +329,22 @@
     </w:p>
     <w:p>
       <w:pPr>
+        <w:pStyle w:val="ListBullet"/>
+        <w:spacing w:after="40"/>
+      </w:pPr>
+      <w:r>
+        <w:rPr>
+          <w:rFonts w:ascii="Arial" w:hAnsi="Arial"/>
+          <w:b w:val="0"/>
+          <w:i w:val="0"/>
+          <w:sz w:val="18"/>
+        </w:rPr>
+        <w:t>AI tools: Working knowledge of Codex, Claude Code and ChatGPT for research, drafting and coding assistance, with outputs reviewed before use.</w:t>
+      </w:r>
+    </w:p>
+    <w:p>
+      <w:pPr>
+        <w:keepNext/>
         <w:spacing w:before="160" w:after="60"/>
       </w:pPr>
       <w:r>
@@ -370,6 +390,7 @@
     </w:p>
     <w:p>
       <w:pPr>
+        <w:keepNext/>
         <w:spacing w:before="160" w:after="60"/>
       </w:pPr>
       <w:r>
@@ -430,6 +451,7 @@
     </w:p>
     <w:p>
       <w:pPr>
+        <w:keepNext/>
         <w:spacing w:before="160" w:after="60"/>
       </w:pPr>
       <w:r>
@@ -490,6 +512,7 @@
     </w:p>
     <w:p>
       <w:pPr>
+        <w:keepNext/>
         <w:spacing w:before="160" w:after="60"/>
       </w:pPr>
       <w:r>
@@ -565,6 +588,7 @@
     </w:p>
     <w:p>
       <w:pPr>
+        <w:keepNext/>
         <w:spacing w:before="160" w:after="60"/>
       </w:pPr>
       <w:r>

</xml_diff>

<commit_message>
Refocus portfolio on field service evidence and align two-page resumes
</commit_message>
<xml_diff>
--- a/assets/Henry_Yang_Biomedical_Engineer_Resume.docx
+++ b/assets/Henry_Yang_Biomedical_Engineer_Resume.docx
@@ -4,672 +4,492 @@
   <w:body>
     <w:p>
       <w:pPr>
-        <w:jc w:val="center"/>
+        <w:spacing w:after="60"/>
       </w:pPr>
       <w:r>
         <w:rPr>
-          <w:rFonts w:ascii="Arial" w:hAnsi="Arial"/>
           <w:b/>
-          <w:i w:val="0"/>
-          <w:color w:val="11365A"/>
-          <w:sz w:val="34"/>
+          <w:sz w:val="44"/>
         </w:rPr>
         <w:t>YIHANG (HENRY) YANG</w:t>
       </w:r>
     </w:p>
     <w:p>
       <w:pPr>
-        <w:jc w:val="center"/>
+        <w:keepLines/>
+        <w:widowControl/>
       </w:pPr>
       <w:r>
         <w:rPr>
-          <w:rFonts w:ascii="Arial" w:hAnsi="Arial"/>
           <w:b/>
-          <w:i w:val="0"/>
-          <w:color w:val="11365A"/>
-          <w:sz w:val="22"/>
+          <w:sz w:val="24"/>
         </w:rPr>
         <w:t>Biomedical Field Service Engineer | Sydney</w:t>
       </w:r>
     </w:p>
     <w:p>
       <w:pPr>
-        <w:jc w:val="center"/>
+        <w:keepLines/>
+        <w:widowControl/>
       </w:pPr>
       <w:r>
         <w:rPr>
-          <w:rFonts w:ascii="Arial" w:hAnsi="Arial"/>
-          <w:b w:val="0"/>
-          <w:i w:val="0"/>
-          <w:color w:val="525252"/>
-          <w:sz w:val="17"/>
+          <w:sz w:val="19"/>
         </w:rPr>
-        <w:t>Sydney, NSW | 0436 016 660 | yangyihang96@gmail.com | Driver licence | Available for Sydney field travel | Work rights available for employer verification</w:t>
+        <w:t>Sydney, NSW  |  0436 016 660  |  yangyihang96@gmail.com</w:t>
+      </w:r>
+    </w:p>
+    <w:p>
+      <w:hyperlink r:id="rId9">
+        <w:r>
+          <w:rPr>
+            <w:color w:val="275DDE"/>
+          </w:rPr>
+          <w:t>yangyihang96.com</w:t>
+        </w:r>
+      </w:hyperlink>
+      <w:r>
+        <w:t xml:space="preserve">  |  </w:t>
+      </w:r>
+      <w:hyperlink r:id="rId10">
+        <w:r>
+          <w:rPr>
+            <w:color w:val="275DDE"/>
+          </w:rPr>
+          <w:t>LinkedIn</w:t>
+        </w:r>
+      </w:hyperlink>
+      <w:r>
+        <w:rPr>
+          <w:sz w:val="19"/>
+        </w:rPr>
+        <w:t xml:space="preserve">  |  Driver licence  |  English / Mandarin</w:t>
+      </w:r>
+    </w:p>
+    <w:p>
+      <w:pPr>
+        <w:pStyle w:val="Heading1"/>
+        <w:pageBreakBefore w:val="0"/>
+      </w:pPr>
+      <w:r>
+        <w:t>PROFESSIONAL PROFILE</w:t>
+      </w:r>
+    </w:p>
+    <w:p>
+      <w:pPr>
+        <w:keepLines/>
+        <w:widowControl/>
+      </w:pPr>
+      <w:r>
+        <w:t>Biomedical engineer with three years of field and workshop experience at Nova Biomedical Australia, supporting medical equipment in hospital and pharmacy settings. Experience includes preventive maintenance, fault diagnosis, repair, field changes and software upgrades. Combines hands-on equipment checks and electrical safety testing with documented verification, clear service records and follow-up of unresolved issues.</w:t>
+      </w:r>
+    </w:p>
+    <w:p>
+      <w:pPr>
+        <w:pStyle w:val="Heading1"/>
+        <w:pageBreakBefore w:val="0"/>
+      </w:pPr>
+      <w:r>
+        <w:t>PROFESSIONAL EXPERIENCE</w:t>
+      </w:r>
+    </w:p>
+    <w:p>
+      <w:pPr>
+        <w:pStyle w:val="Heading2"/>
+      </w:pPr>
+      <w:r>
+        <w:t>Biomedical Engineer | Nova Biomedical Australia</w:t>
       </w:r>
     </w:p>
     <w:p>
       <w:pPr>
         <w:keepNext/>
-        <w:spacing w:before="160" w:after="60"/>
+        <w:keepLines/>
+        <w:widowControl/>
       </w:pPr>
       <w:r>
         <w:rPr>
-          <w:rFonts w:ascii="Arial" w:hAnsi="Arial"/>
-          <w:b/>
-          <w:i w:val="0"/>
-          <w:color w:val="11365A"/>
-          <w:sz w:val="20"/>
+          <w:color w:val="43546B"/>
+          <w:sz w:val="19"/>
         </w:rPr>
-        <w:t>PROFESSIONAL PROFILE</w:t>
-      </w:r>
-    </w:p>
-    <w:p>
-      <w:pPr>
-        <w:spacing w:after="80"/>
-      </w:pPr>
-      <w:r>
-        <w:rPr>
-          <w:rFonts w:ascii="Arial" w:hAnsi="Arial"/>
-          <w:b w:val="0"/>
-          <w:i w:val="0"/>
-          <w:sz w:val="18"/>
-        </w:rPr>
-        <w:t>Three years of field and workshop service experience at Nova Biomedical Australia with medical equipment used in hospital and pharmacy settings. Core strengths include preventive maintenance (PM), fault diagnosis, repair, installation support, verification, service documentation, and return-to-use or escalation decisions.</w:t>
-      </w:r>
-    </w:p>
-    <w:p>
-      <w:pPr>
-        <w:keepNext/>
-        <w:spacing w:before="160" w:after="60"/>
-      </w:pPr>
-      <w:r>
-        <w:rPr>
-          <w:rFonts w:ascii="Arial" w:hAnsi="Arial"/>
-          <w:b/>
-          <w:i w:val="0"/>
-          <w:color w:val="11365A"/>
-          <w:sz w:val="20"/>
-        </w:rPr>
-        <w:t>PROFESSIONAL EXPERIENCE</w:t>
-      </w:r>
-    </w:p>
-    <w:p>
-      <w:r>
-        <w:rPr>
-          <w:rFonts w:ascii="Arial" w:hAnsi="Arial"/>
-          <w:b/>
-          <w:i w:val="0"/>
-          <w:color w:val="11365A"/>
-          <w:sz w:val="20"/>
-        </w:rPr>
-        <w:t>Biomedical Engineer | Nova Biomedical Australia</w:t>
-      </w:r>
-      <w:r>
-        <w:rPr>
-          <w:rFonts w:ascii="Arial" w:hAnsi="Arial"/>
-          <w:b w:val="0"/>
-          <w:i w:val="0"/>
-          <w:color w:val="525252"/>
-          <w:sz w:val="18"/>
-        </w:rPr>
-        <w:t xml:space="preserve"> | Field service across Australia / workshop repair | Jul 2023 - Present</w:t>
+        <w:t>Jul 2023 – Present | Field service across Australia / workshop repair</w:t>
       </w:r>
     </w:p>
     <w:p>
       <w:pPr>
         <w:pStyle w:val="ListBullet"/>
-        <w:spacing w:after="40"/>
+        <w:keepLines/>
+        <w:widowControl/>
       </w:pPr>
       <w:r>
-        <w:rPr>
-          <w:rFonts w:ascii="Arial" w:hAnsi="Arial"/>
-          <w:b w:val="0"/>
-          <w:i w:val="0"/>
-          <w:sz w:val="18"/>
-        </w:rPr>
-        <w:t>Perform preventive maintenance (PM), fault diagnosis, repair, installation support, verification, and service documentation across field and workshop settings.</w:t>
+        <w:t>Carry out preventive maintenance, fault diagnosis and repair for hospital and pharmacy equipment, using manufacturer documentation and applicable service procedures.</w:t>
       </w:r>
     </w:p>
     <w:p>
       <w:pPr>
         <w:pStyle w:val="ListBullet"/>
-        <w:spacing w:after="40"/>
+        <w:keepLines/>
+        <w:widowControl/>
       </w:pPr>
       <w:r>
-        <w:rPr>
-          <w:rFonts w:ascii="Arial" w:hAnsi="Arial"/>
-          <w:b w:val="0"/>
-          <w:i w:val="0"/>
-          <w:sz w:val="18"/>
-        </w:rPr>
-        <w:t>Support ventilation, patient monitoring, ultrasound, DEXA, pharmacy automation, X-ray support, and general biomedical equipment.</w:t>
+        <w:t>Support field changes, software upgrades and installation work; track assigned equipment and coordinate access around clinical activity.</w:t>
       </w:r>
     </w:p>
     <w:p>
       <w:pPr>
         <w:pStyle w:val="ListBullet"/>
-        <w:spacing w:after="40"/>
+        <w:keepLines/>
+        <w:widowControl/>
       </w:pPr>
       <w:r>
-        <w:rPr>
-          <w:rFonts w:ascii="Arial" w:hAnsi="Arial"/>
-          <w:b w:val="0"/>
-          <w:i w:val="0"/>
-          <w:sz w:val="18"/>
-        </w:rPr>
-        <w:t>Document service outcomes with functional checks, performance evidence, or clear escalation status.</w:t>
+        <w:t>Perform functional checks and documented verification, including electrical safety testing during Affiniti 70G and CX50 ultrasound maintenance.</w:t>
       </w:r>
     </w:p>
     <w:p>
       <w:pPr>
         <w:pStyle w:val="ListBullet"/>
-        <w:spacing w:after="40"/>
+        <w:keepLines/>
+        <w:widowControl/>
       </w:pPr>
       <w:r>
-        <w:rPr>
-          <w:rFonts w:ascii="Arial" w:hAnsi="Arial"/>
-          <w:b w:val="0"/>
-          <w:i w:val="0"/>
-          <w:sz w:val="18"/>
-        </w:rPr>
-        <w:t>Use manufacturer-led checks, service history, and functional evidence to document whether equipment is ready for use, requires follow-up, or needs escalation.</w:t>
+        <w:t>Record faults, incomplete work and follow-up requirements, and escalate issues that need further technical support.</w:t>
       </w:r>
     </w:p>
     <w:p>
       <w:pPr>
         <w:pStyle w:val="ListBullet"/>
-        <w:spacing w:after="40"/>
+        <w:keepLines/>
+        <w:widowControl/>
       </w:pPr>
       <w:r>
-        <w:rPr>
-          <w:rFonts w:ascii="Arial" w:hAnsi="Arial"/>
-          <w:b w:val="0"/>
-          <w:i w:val="0"/>
-          <w:sz w:val="18"/>
-        </w:rPr>
-        <w:t>Maintain Simpro work orders, service reports, equipment history, and communication notes as a traceable service history.</w:t>
+        <w:t>Maintain Simpro work orders, service reports and equipment history, with clear completion status and handover notes.</w:t>
       </w:r>
     </w:p>
     <w:p>
       <w:pPr>
-        <w:keepNext/>
-        <w:spacing w:before="160" w:after="60"/>
+        <w:pStyle w:val="Heading1"/>
+        <w:pageBreakBefore w:val="0"/>
       </w:pPr>
       <w:r>
-        <w:rPr>
-          <w:rFonts w:ascii="Arial" w:hAnsi="Arial"/>
-          <w:b/>
-          <w:i w:val="0"/>
-          <w:color w:val="11365A"/>
-          <w:sz w:val="20"/>
-        </w:rPr>
-        <w:t>EQUIPMENT AND SERVICE SCOPE</w:t>
+        <w:t>SELECTED SERVICE PROJECTS</w:t>
       </w:r>
     </w:p>
     <w:p>
       <w:pPr>
-        <w:pStyle w:val="ListBullet"/>
-        <w:spacing w:after="40"/>
+        <w:pStyle w:val="Heading2"/>
       </w:pPr>
       <w:r>
-        <w:rPr>
-          <w:rFonts w:ascii="Arial" w:hAnsi="Arial"/>
-          <w:b w:val="0"/>
-          <w:i w:val="0"/>
-          <w:sz w:val="18"/>
-        </w:rPr>
-        <w:t>Respiratory: V60, V60 Plus, Trilogy; planned service, checks, and troubleshooting preparation.</w:t>
+        <w:t>Philips Affiniti 70G / CX50 · 2025</w:t>
       </w:r>
     </w:p>
     <w:p>
       <w:pPr>
-        <w:pStyle w:val="ListBullet"/>
-        <w:spacing w:after="40"/>
+        <w:keepLines/>
+        <w:widowControl/>
       </w:pPr>
       <w:r>
-        <w:rPr>
-          <w:rFonts w:ascii="Arial" w:hAnsi="Arial"/>
-          <w:b w:val="0"/>
-          <w:i w:val="0"/>
-          <w:sz w:val="18"/>
-        </w:rPr>
-        <w:t>Monitoring: Avalon, Efficia, HeartStart; service preparation, checks, and handover notes.</w:t>
+        <w:t>Preventive maintenance with functional checks, electrical safety testing and completed reports recording a pass. Checked controls, connectors, filters and fans; reviewed diagnostics and logs, and completed electrical safety and applicable probe testing.</w:t>
       </w:r>
     </w:p>
     <w:p>
       <w:pPr>
-        <w:pStyle w:val="ListBullet"/>
-        <w:spacing w:after="40"/>
+        <w:pStyle w:val="Heading2"/>
       </w:pPr>
       <w:r>
-        <w:rPr>
-          <w:rFonts w:ascii="Arial" w:hAnsi="Arial"/>
-          <w:b w:val="0"/>
-          <w:i w:val="0"/>
-          <w:sz w:val="18"/>
-        </w:rPr>
-        <w:t>Imaging and diagnostics: EPIQ, Affiniti, CX30, CX50, Horizon DEXA, and X-ray support.</w:t>
+        <w:t>Philips IntelliVue X3 · 2026</w:t>
       </w:r>
     </w:p>
     <w:p>
       <w:pPr>
-        <w:pStyle w:val="ListBullet"/>
-        <w:spacing w:after="40"/>
+        <w:keepLines/>
+        <w:widowControl/>
       </w:pPr>
       <w:r>
-        <w:rPr>
-          <w:rFonts w:ascii="Arial" w:hAnsi="Arial"/>
-          <w:b w:val="0"/>
-          <w:i w:val="0"/>
-          <w:sz w:val="18"/>
-        </w:rPr>
-        <w:t>Pharmacy automation: BD FIX100, Pyxis, ROWA, workflow support, records, and handover.</w:t>
+        <w:t>Tracked upgrades and configuration work across clinical areas, recording completed units and exceptions for follow-up. Submitted completion records for the located units in the assigned areas. Unlocated equipment, a missing C12 option and access restricted by occupied theatres were recorded for follow-up.</w:t>
       </w:r>
     </w:p>
     <w:p>
       <w:pPr>
-        <w:keepNext/>
-        <w:spacing w:before="160" w:after="60"/>
+        <w:pStyle w:val="Heading2"/>
       </w:pPr>
       <w:r>
-        <w:rPr>
-          <w:rFonts w:ascii="Arial" w:hAnsi="Arial"/>
-          <w:b/>
-          <w:i w:val="0"/>
-          <w:color w:val="11365A"/>
-          <w:sz w:val="20"/>
-        </w:rPr>
-        <w:t>TECHNICAL SKILLS</w:t>
+        <w:t>Philips Respironics V60 · 2026</w:t>
       </w:r>
     </w:p>
     <w:p>
       <w:pPr>
-        <w:pStyle w:val="ListBullet"/>
-        <w:spacing w:after="40"/>
+        <w:keepLines/>
+        <w:widowControl/>
       </w:pPr>
       <w:r>
-        <w:rPr>
-          <w:rFonts w:ascii="Arial" w:hAnsi="Arial"/>
-          <w:b w:val="0"/>
-          <w:i w:val="0"/>
-          <w:sz w:val="18"/>
-        </w:rPr>
-        <w:t>PM procedures, fault diagnosis, functional testing, performance verification, service reports, and escalation notes.</w:t>
+        <w:t>The remaining assigned V60 field-change work was completed and reported in April 2026.</w:t>
       </w:r>
     </w:p>
     <w:p>
       <w:pPr>
-        <w:pStyle w:val="ListBullet"/>
-        <w:spacing w:after="40"/>
+        <w:pStyle w:val="Heading1"/>
+        <w:pageBreakBefore/>
       </w:pPr>
       <w:r>
-        <w:rPr>
-          <w:rFonts w:ascii="Arial" w:hAnsi="Arial"/>
-          <w:b w:val="0"/>
-          <w:i w:val="0"/>
-          <w:sz w:val="18"/>
-        </w:rPr>
-        <w:t>Simpro / CMMS, equipment history, equipment identifiers, communication notes, traceability, manufacturer documentation, and Microsoft Office.</w:t>
+        <w:t>EQUIPMENT &amp; COMPLETED TRAINING</w:t>
       </w:r>
     </w:p>
     <w:p>
       <w:pPr>
-        <w:pStyle w:val="ListBullet"/>
-        <w:spacing w:after="40"/>
+        <w:keepLines/>
+        <w:widowControl/>
       </w:pPr>
       <w:r>
         <w:rPr>
-          <w:rFonts w:ascii="Arial" w:hAnsi="Arial"/>
-          <w:b w:val="0"/>
-          <w:i w:val="0"/>
-          <w:sz w:val="18"/>
+          <w:b/>
         </w:rPr>
-        <w:t>Electrical safety testing awareness, test equipment familiarity, service handover, Mandarin Chinese, and professional working proficiency in English.</w:t>
+        <w:t xml:space="preserve">Respiratory — </w:t>
+      </w:r>
+      <w:r>
+        <w:t>V60 / V60 Plus eLearning, Trilogy 202 service training and Trilogy Evo servicing (2023–2024). V60 field-change, maintenance and verification work.</w:t>
       </w:r>
     </w:p>
     <w:p>
       <w:pPr>
-        <w:pStyle w:val="ListBullet"/>
-        <w:spacing w:after="40"/>
+        <w:keepLines/>
+        <w:widowControl/>
       </w:pPr>
       <w:r>
         <w:rPr>
-          <w:rFonts w:ascii="Arial" w:hAnsi="Arial"/>
-          <w:b w:val="0"/>
-          <w:i w:val="0"/>
-          <w:sz w:val="18"/>
+          <w:b/>
         </w:rPr>
-        <w:t>AI tools: Working knowledge of Codex, Claude Code and ChatGPT for research, drafting and coding assistance, with outputs reviewed before use.</w:t>
+        <w:t xml:space="preserve">Ultrasound — </w:t>
+      </w:r>
+      <w:r>
+        <w:t>Ultrasound Essentials, EPIQ / Affiniti and CX30 / CX50 / SPARQ FSE training, Sydney (March 2023). Affiniti 70G / CX50 preventive maintenance.</w:t>
       </w:r>
     </w:p>
     <w:p>
       <w:pPr>
-        <w:keepNext/>
-        <w:spacing w:before="160" w:after="60"/>
+        <w:keepLines/>
+        <w:widowControl/>
       </w:pPr>
       <w:r>
         <w:rPr>
-          <w:rFonts w:ascii="Arial" w:hAnsi="Arial"/>
           <w:b/>
-          <w:i w:val="0"/>
-          <w:color w:val="11365A"/>
-          <w:sz w:val="20"/>
         </w:rPr>
-        <w:t>EARLIER HEALTHCARE DOCUMENTATION</w:t>
+        <w:t xml:space="preserve">Patient monitoring — </w:t>
+      </w:r>
+      <w:r>
+        <w:t>Efficia CM series, MX40 installation / service and Avalon FM20 / FM30 support training (2023). IntelliVue X3 field configuration and upgrade work (2026).</w:t>
       </w:r>
     </w:p>
     <w:p>
       <w:pPr>
-        <w:pStyle w:val="ListBullet"/>
-        <w:spacing w:after="40"/>
+        <w:keepLines/>
+        <w:widowControl/>
       </w:pPr>
       <w:r>
         <w:rPr>
-          <w:rFonts w:ascii="Arial" w:hAnsi="Arial"/>
-          <w:b w:val="0"/>
-          <w:i w:val="0"/>
-          <w:sz w:val="18"/>
+          <w:b/>
         </w:rPr>
-        <w:t>Pharmacovigilance Department Assistant, Lundbeck Beijing, Dec 2019 - Feb 2020.</w:t>
+        <w:t xml:space="preserve">ECG &amp; defibrillation — </w:t>
+      </w:r>
+      <w:r>
+        <w:t>PageWriter TC20 / TC30 / TC50 course (2023); HeartStart Intrepid service training (2025). TC50 field-upgrade experience.</w:t>
       </w:r>
     </w:p>
     <w:p>
       <w:pPr>
-        <w:pStyle w:val="ListBullet"/>
-        <w:spacing w:after="40"/>
+        <w:keepLines/>
+        <w:widowControl/>
       </w:pPr>
       <w:r>
         <w:rPr>
-          <w:rFonts w:ascii="Arial" w:hAnsi="Arial"/>
-          <w:b w:val="0"/>
-          <w:i w:val="0"/>
-          <w:sz w:val="18"/>
+          <w:b/>
         </w:rPr>
-        <w:t>Supported adverse reaction record handling and regulated drug-safety documentation.</w:t>
+        <w:t xml:space="preserve">Pharmacy automation — </w:t>
+      </w:r>
+      <w:r>
+        <w:t>BD FIX100 dispensing service and Pyxis MedStation / PAS ES hardware courses (January 2024). Rowa Vmax / ProLog preventive maintenance and fault reporting.</w:t>
       </w:r>
     </w:p>
     <w:p>
       <w:pPr>
-        <w:keepNext/>
-        <w:spacing w:before="160" w:after="60"/>
+        <w:keepLines/>
+        <w:widowControl/>
       </w:pPr>
       <w:r>
         <w:rPr>
-          <w:rFonts w:ascii="Arial" w:hAnsi="Arial"/>
           <w:b/>
-          <w:i w:val="0"/>
-          <w:color w:val="11365A"/>
-          <w:sz w:val="20"/>
         </w:rPr>
-        <w:t>EDUCATION</w:t>
+        <w:t xml:space="preserve">Emergency care — </w:t>
+      </w:r>
+      <w:r>
+        <w:t>corpuls3 software-upgrade project training and subsequent field rollout, equipment replacement and completion tracking (2026).</w:t>
       </w:r>
     </w:p>
     <w:p>
       <w:pPr>
-        <w:pStyle w:val="ListBullet"/>
-        <w:spacing w:after="40"/>
+        <w:keepLines/>
+        <w:widowControl/>
       </w:pPr>
       <w:r>
         <w:rPr>
-          <w:rFonts w:ascii="Arial" w:hAnsi="Arial"/>
-          <w:b w:val="0"/>
-          <w:i w:val="0"/>
-          <w:sz w:val="18"/>
+          <w:b/>
         </w:rPr>
-        <w:t>Master of Philosophy, The University of Sydney, awarded Jun 2024.</w:t>
+        <w:t xml:space="preserve">Bone &amp; surgical imaging — </w:t>
+      </w:r>
+      <w:r>
+        <w:t>Hologic Horizon EMI remediation installation training (May 2025) and project work. Trident HD power-on and device-information capture support.</w:t>
       </w:r>
     </w:p>
     <w:p>
       <w:pPr>
-        <w:pStyle w:val="ListBullet"/>
-        <w:spacing w:after="40"/>
+        <w:keepLines/>
+        <w:widowControl/>
       </w:pPr>
       <w:r>
         <w:rPr>
-          <w:rFonts w:ascii="Arial" w:hAnsi="Arial"/>
-          <w:b w:val="0"/>
-          <w:i w:val="0"/>
-          <w:sz w:val="18"/>
+          <w:b/>
         </w:rPr>
-        <w:t>Bachelor of Biomedical Engineering, The University of Sydney, Feb 2017 - Dec 2020.</w:t>
+        <w:t xml:space="preserve">Sterilisation &amp; disinfection — </w:t>
+      </w:r>
+      <w:r>
+        <w:t>Internal practical training on benchtop Class B / S sterilisers and washer-disinfectors (August 2026).</w:t>
       </w:r>
     </w:p>
     <w:p>
       <w:pPr>
-        <w:pStyle w:val="ListBullet"/>
-        <w:spacing w:after="40"/>
+        <w:pStyle w:val="Heading1"/>
+        <w:pageBreakBefore w:val="0"/>
       </w:pPr>
       <w:r>
-        <w:rPr>
-          <w:rFonts w:ascii="Arial" w:hAnsi="Arial"/>
-          <w:b w:val="0"/>
-          <w:i w:val="0"/>
-          <w:sz w:val="18"/>
-        </w:rPr>
-        <w:t>MPhil thesis: flexible electrodes, impedance measurement, validation evidence, and technical documentation.</w:t>
+        <w:t>EDUCATION &amp; RESEARCH</w:t>
       </w:r>
     </w:p>
     <w:p>
       <w:pPr>
-        <w:keepNext/>
-        <w:spacing w:before="160" w:after="60"/>
+        <w:keepLines/>
+        <w:widowControl/>
       </w:pPr>
       <w:r>
         <w:rPr>
-          <w:rFonts w:ascii="Arial" w:hAnsi="Arial"/>
           <w:b/>
-          <w:i w:val="0"/>
-          <w:color w:val="11365A"/>
-          <w:sz w:val="20"/>
         </w:rPr>
-        <w:t>SELECTED SERVICE OUTCOMES</w:t>
+        <w:t xml:space="preserve">Master of Philosophy | </w:t>
+      </w:r>
+      <w:r>
+        <w:t>The University of Sydney | Awarded Jun 2024</w:t>
       </w:r>
     </w:p>
     <w:p>
       <w:pPr>
-        <w:pStyle w:val="ListBullet"/>
-        <w:spacing w:after="40"/>
+        <w:keepLines/>
+        <w:widowControl/>
       </w:pPr>
       <w:r>
-        <w:rPr>
-          <w:rFonts w:ascii="Arial" w:hAnsi="Arial"/>
-          <w:b w:val="0"/>
-          <w:i w:val="0"/>
-          <w:sz w:val="18"/>
-        </w:rPr>
-        <w:t>Supported PM, repair, verification, and documentation across ventilation, monitoring, ultrasound, DEXA, pharmacy automation, and general biomedical equipment in hospital, pharmacy, and workshop settings.</w:t>
+        <w:t>Flexible-electrode research: experimental planning, impedance measurement, validation and technical documentation.</w:t>
       </w:r>
     </w:p>
     <w:p>
       <w:pPr>
-        <w:pStyle w:val="ListBullet"/>
-        <w:spacing w:after="40"/>
+        <w:keepLines/>
+        <w:widowControl/>
       </w:pPr>
       <w:r>
         <w:rPr>
-          <w:rFonts w:ascii="Arial" w:hAnsi="Arial"/>
-          <w:b w:val="0"/>
-          <w:i w:val="0"/>
-          <w:sz w:val="18"/>
+          <w:b/>
         </w:rPr>
-        <w:t>Diagnosed user-reported faults by separating device condition, accessory context, workflow, repair history, reproducible symptoms, procedure-led checks, and post-repair verification.</w:t>
+        <w:t xml:space="preserve">Bachelor of Biomedical Engineering | </w:t>
+      </w:r>
+      <w:r>
+        <w:t>The University of Sydney | Feb 2017 – Dec 2020</w:t>
       </w:r>
     </w:p>
     <w:p>
       <w:pPr>
-        <w:pStyle w:val="ListBullet"/>
-        <w:spacing w:after="40"/>
+        <w:pStyle w:val="Heading1"/>
+        <w:pageBreakBefore w:val="0"/>
       </w:pPr>
       <w:r>
-        <w:rPr>
-          <w:rFonts w:ascii="Arial" w:hAnsi="Arial"/>
-          <w:b w:val="0"/>
-          <w:i w:val="0"/>
-          <w:sz w:val="18"/>
-        </w:rPr>
-        <w:t>Supported next-use decisions by documenting whether equipment was ready for use, required follow-up, or needed escalation based on post-service evidence.</w:t>
+        <w:t>EARLIER EXPERIENCE</w:t>
       </w:r>
     </w:p>
     <w:p>
       <w:pPr>
-        <w:keepNext/>
-        <w:spacing w:before="160" w:after="60"/>
+        <w:keepLines/>
+        <w:widowControl/>
       </w:pPr>
       <w:r>
         <w:rPr>
-          <w:rFonts w:ascii="Arial" w:hAnsi="Arial"/>
           <w:b/>
-          <w:i w:val="0"/>
-          <w:color w:val="11365A"/>
-          <w:sz w:val="20"/>
         </w:rPr>
-        <w:t>TARGET ROLES</w:t>
+        <w:t xml:space="preserve">Pharmacovigilance Department Assistant | </w:t>
+      </w:r>
+      <w:r>
+        <w:t>Lundbeck Beijing | Dec 2019 – Feb 2020</w:t>
       </w:r>
     </w:p>
     <w:p>
       <w:pPr>
-        <w:pStyle w:val="ListBullet"/>
-        <w:spacing w:after="40"/>
+        <w:keepLines/>
+        <w:widowControl/>
       </w:pPr>
       <w:r>
-        <w:rPr>
-          <w:rFonts w:ascii="Arial" w:hAnsi="Arial"/>
-          <w:b w:val="0"/>
-          <w:i w:val="0"/>
-          <w:sz w:val="18"/>
-        </w:rPr>
-        <w:t>Biomedical Field Service Engineer.</w:t>
+        <w:t>Adverse-reaction records, drug-safety documentation and cross-functional communication.</w:t>
       </w:r>
     </w:p>
     <w:p>
       <w:pPr>
-        <w:pStyle w:val="ListBullet"/>
-        <w:spacing w:after="40"/>
+        <w:pStyle w:val="Heading1"/>
+        <w:pageBreakBefore w:val="0"/>
       </w:pPr>
       <w:r>
-        <w:rPr>
-          <w:rFonts w:ascii="Arial" w:hAnsi="Arial"/>
-          <w:b w:val="0"/>
-          <w:i w:val="0"/>
-          <w:sz w:val="18"/>
-        </w:rPr>
-        <w:t>Medical Device Service Engineer.</w:t>
+        <w:t>DIGITAL TOOLS &amp; APPLIED AI</w:t>
       </w:r>
     </w:p>
     <w:p>
       <w:pPr>
-        <w:pStyle w:val="ListBullet"/>
-        <w:spacing w:after="40"/>
+        <w:keepLines/>
+        <w:widowControl/>
       </w:pPr>
       <w:r>
-        <w:rPr>
-          <w:rFonts w:ascii="Arial" w:hAnsi="Arial"/>
-          <w:b w:val="0"/>
-          <w:i w:val="0"/>
-          <w:sz w:val="18"/>
-        </w:rPr>
-        <w:t>Clinical Engineering Service Support.</w:t>
+        <w:t>Simpro for work orders and service history. Microsoft Office for technical records, completion workbooks and handover documents.</w:t>
       </w:r>
     </w:p>
     <w:p>
       <w:pPr>
-        <w:pStyle w:val="ListBullet"/>
-        <w:spacing w:after="40"/>
+        <w:keepLines/>
+        <w:widowControl/>
       </w:pPr>
       <w:r>
-        <w:rPr>
-          <w:rFonts w:ascii="Arial" w:hAnsi="Arial"/>
-          <w:b w:val="0"/>
-          <w:i w:val="0"/>
-          <w:sz w:val="18"/>
-        </w:rPr>
-        <w:t>Biomedical Technician / Service Technician.</w:t>
-      </w:r>
-    </w:p>
-    <w:p>
-      <w:pPr>
-        <w:keepNext/>
-        <w:spacing w:before="160" w:after="60"/>
-      </w:pPr>
-      <w:r>
-        <w:rPr>
-          <w:rFonts w:ascii="Arial" w:hAnsi="Arial"/>
-          <w:b/>
-          <w:i w:val="0"/>
-          <w:color w:val="11365A"/>
-          <w:sz w:val="20"/>
-        </w:rPr>
-        <w:t>FIELD SERVICE TOOLS</w:t>
-      </w:r>
-    </w:p>
-    <w:p>
-      <w:pPr>
-        <w:pStyle w:val="ListBullet"/>
-        <w:spacing w:after="40"/>
-      </w:pPr>
-      <w:r>
-        <w:rPr>
-          <w:rFonts w:ascii="Arial" w:hAnsi="Arial"/>
-          <w:b w:val="0"/>
-          <w:i w:val="0"/>
-          <w:sz w:val="18"/>
-        </w:rPr>
-        <w:t>PM procedures, service manuals, functional testing, performance verification, and clear escalation notes.</w:t>
-      </w:r>
-    </w:p>
-    <w:p>
-      <w:pPr>
-        <w:pStyle w:val="ListBullet"/>
-        <w:spacing w:after="40"/>
-      </w:pPr>
-      <w:r>
-        <w:rPr>
-          <w:rFonts w:ascii="Arial" w:hAnsi="Arial"/>
-          <w:b w:val="0"/>
-          <w:i w:val="0"/>
-          <w:sz w:val="18"/>
-        </w:rPr>
-        <w:t>Simpro / CMMS, service reports, equipment history, communication notes, handover records, and traceable service evidence.</w:t>
-      </w:r>
-    </w:p>
-    <w:p>
-      <w:pPr>
-        <w:pStyle w:val="ListBullet"/>
-        <w:spacing w:after="40"/>
-      </w:pPr>
-      <w:r>
-        <w:rPr>
-          <w:rFonts w:ascii="Arial" w:hAnsi="Arial"/>
-          <w:b w:val="0"/>
-          <w:i w:val="0"/>
-          <w:sz w:val="18"/>
-        </w:rPr>
-        <w:t>Electrical safety testing awareness, test equipment familiarity, and manufacturer documentation.</w:t>
-      </w:r>
-    </w:p>
-    <w:p>
-      <w:pPr>
-        <w:pStyle w:val="ListBullet"/>
-        <w:spacing w:after="40"/>
-      </w:pPr>
-      <w:r>
-        <w:rPr>
-          <w:rFonts w:ascii="Arial" w:hAnsi="Arial"/>
-          <w:b w:val="0"/>
-          <w:i w:val="0"/>
-          <w:sz w:val="18"/>
-        </w:rPr>
-        <w:t>Mandarin Chinese native; English professional working proficiency.</w:t>
+        <w:t>I use Codex, Claude Code and ChatGPT for research, document drafting and coding assistance, checking facts, content and behaviour before use.</w:t>
       </w:r>
     </w:p>
     <w:sectPr>
-      <w:pgSz w:w="12240" w:h="15840"/>
-      <w:pgMar w:top="648" w:right="835" w:bottom="648" w:left="835" w:header="720" w:footer="720" w:gutter="0"/>
+      <w:footerReference w:type="default" r:id="rId11"/>
+      <w:pgSz w:w="11906" w:h="16838"/>
+      <w:pgMar w:top="907" w:right="1020" w:bottom="907" w:left="1020" w:header="720" w:footer="454" w:gutter="0"/>
       <w:cols w:space="720"/>
       <w:docGrid w:linePitch="360"/>
     </w:sectPr>
   </w:body>
 </w:document>
+</file>
+
+<file path=word/footer1.xml><?xml version="1.0" encoding="utf-8"?>
+<w:ftr xmlns:m="http://schemas.openxmlformats.org/officeDocument/2006/math" xmlns:mc="http://schemas.openxmlformats.org/markup-compatibility/2006" xmlns:mo="http://schemas.microsoft.com/office/mac/office/2008/main" xmlns:mv="urn:schemas-microsoft-com:mac:vml" xmlns:o="urn:schemas-microsoft-com:office:office" xmlns:r="http://schemas.openxmlformats.org/officeDocument/2006/relationships" xmlns:v="urn:schemas-microsoft-com:vml" xmlns:w10="urn:schemas-microsoft-com:office:word" xmlns:w14="http://schemas.microsoft.com/office/word/2010/wordml" xmlns:w="http://schemas.openxmlformats.org/wordprocessingml/2006/main" xmlns:wne="http://schemas.microsoft.com/office/word/2006/wordml" xmlns:wp14="http://schemas.microsoft.com/office/word/2010/wordprocessingDrawing" xmlns:wp="http://schemas.openxmlformats.org/drawingml/2006/wordprocessingDrawing" xmlns:wpc="http://schemas.microsoft.com/office/word/2010/wordprocessingCanvas" xmlns:wpg="http://schemas.microsoft.com/office/word/2010/wordprocessingGroup" xmlns:wpi="http://schemas.microsoft.com/office/word/2010/wordprocessingInk" xmlns:wps="http://schemas.microsoft.com/office/word/2010/wordprocessingShape" mc:Ignorable="w14 wp14">
+  <w:p>
+    <w:pPr>
+      <w:pStyle w:val="Footer"/>
+      <w:jc w:val="right"/>
+    </w:pPr>
+    <w:r>
+      <w:rPr>
+        <w:color w:val="43546B"/>
+        <w:sz w:val="16"/>
+      </w:rPr>
+      <w:t xml:space="preserve">Yihang (Henry) Yang  ·  </w:t>
+    </w:r>
+    <w:fldSimple w:instr="PAGE"/>
+  </w:p>
+</w:ftr>
 </file>
 
 <file path=word/numbering.xml><?xml version="1.0" encoding="utf-8"?>
@@ -1035,9 +855,13 @@
     <w:name w:val="Normal"/>
     <w:qFormat/>
     <w:rsid w:val="00FC693F"/>
+    <w:pPr>
+      <w:spacing w:line="269" w:lineRule="auto" w:after="120"/>
+    </w:pPr>
     <w:rPr>
       <w:rFonts w:ascii="Arial" w:hAnsi="Arial"/>
-      <w:sz w:val="18"/>
+      <w:color w:val="15283F"/>
+      <w:sz w:val="22"/>
     </w:rPr>
   </w:style>
   <w:style w:type="paragraph" w:styleId="Header">
@@ -1095,15 +919,15 @@
     <w:pPr>
       <w:keepNext/>
       <w:keepLines/>
-      <w:spacing w:before="480" w:after="0"/>
+      <w:spacing w:before="220" w:after="100"/>
       <w:outlineLvl w:val="0"/>
     </w:pPr>
     <w:rPr>
-      <w:rFonts w:asciiTheme="majorHAnsi" w:eastAsiaTheme="majorEastAsia" w:hAnsiTheme="majorHAnsi" w:cstheme="majorBidi"/>
+      <w:rFonts w:asciiTheme="majorHAnsi" w:eastAsiaTheme="majorEastAsia" w:hAnsiTheme="majorHAnsi" w:cstheme="majorBidi" w:ascii="Arial" w:hAnsi="Arial"/>
       <w:b/>
       <w:bCs/>
-      <w:color w:val="365F91" w:themeColor="accent1" w:themeShade="BF"/>
-      <w:sz w:val="28"/>
+      <w:color w:val="15283F"/>
+      <w:sz w:val="24"/>
       <w:szCs w:val="28"/>
     </w:rPr>
   </w:style>
@@ -1119,15 +943,15 @@
     <w:pPr>
       <w:keepNext/>
       <w:keepLines/>
-      <w:spacing w:before="200" w:after="0"/>
+      <w:spacing w:before="120" w:after="100"/>
       <w:outlineLvl w:val="1"/>
     </w:pPr>
     <w:rPr>
-      <w:rFonts w:asciiTheme="majorHAnsi" w:eastAsiaTheme="majorEastAsia" w:hAnsiTheme="majorHAnsi" w:cstheme="majorBidi"/>
+      <w:rFonts w:asciiTheme="majorHAnsi" w:eastAsiaTheme="majorEastAsia" w:hAnsiTheme="majorHAnsi" w:cstheme="majorBidi" w:ascii="Arial" w:hAnsi="Arial"/>
       <w:b/>
       <w:bCs/>
-      <w:color w:val="4F81BD" w:themeColor="accent1"/>
-      <w:sz w:val="26"/>
+      <w:color w:val="15283F"/>
+      <w:sz w:val="21"/>
       <w:szCs w:val="26"/>
     </w:rPr>
   </w:style>
@@ -1566,8 +1390,14 @@
       <w:numPr>
         <w:numId w:val="1"/>
       </w:numPr>
+      <w:spacing w:after="100"/>
+      <w:ind w:left="198" w:hanging="198"/>
       <w:contextualSpacing/>
     </w:pPr>
+    <w:rPr>
+      <w:rFonts w:ascii="Arial" w:hAnsi="Arial"/>
+      <w:sz w:val="22"/>
+    </w:rPr>
   </w:style>
   <w:style w:type="paragraph" w:styleId="ListBullet2">
     <w:name w:val="List Bullet 2"/>

</xml_diff>

<commit_message>
Refine biomedical service portfolio and harden content generation
</commit_message>
<xml_diff>
--- a/assets/Henry_Yang_Biomedical_Engineer_Resume.docx
+++ b/assets/Henry_Yang_Biomedical_Engineer_Resume.docx
@@ -81,7 +81,7 @@
         <w:widowControl/>
       </w:pPr>
       <w:r>
-        <w:t>Biomedical engineer with three years of field and workshop experience at Nova Biomedical Australia, supporting medical equipment in hospital and pharmacy settings. Experience includes preventive maintenance, fault diagnosis, repair, field changes and software upgrades. Combines hands-on equipment checks and electrical safety testing with documented verification, clear service records and follow-up of unresolved issues.</w:t>
+        <w:t>Biomedical engineer at Nova Biomedical Australia since July 2023, supporting hospital and pharmacy equipment through field service and workshop repair. Experience includes preventive maintenance, fault diagnosis, repair, field changes and software upgrades. Combines hands-on equipment checks and electrical safety testing with documented verification, service records and follow-up of unresolved issues.</w:t>
       </w:r>
     </w:p>
     <w:p>
@@ -112,7 +112,7 @@
           <w:color w:val="43546B"/>
           <w:sz w:val="19"/>
         </w:rPr>
-        <w:t>Jul 2023 – Present | Field service across Australia / workshop repair</w:t>
+        <w:t>Jul 2023 – Present | Field service / workshop repair</w:t>
       </w:r>
     </w:p>
     <w:p>
@@ -188,7 +188,7 @@
         <w:widowControl/>
       </w:pPr>
       <w:r>
-        <w:t>Preventive maintenance with functional checks, electrical safety testing and completed reports recording a pass. Checked controls, connectors, filters and fans; reviewed diagnostics and logs, and completed electrical safety and applicable probe testing.</w:t>
+        <w:t>Checked controls, connectors, filters and fans; reviewed diagnostics and logs, and completed electrical safety and applicable probe testing. Both preventive-maintenance visits were documented with a pass result and completed service reports.</w:t>
       </w:r>
     </w:p>
     <w:p>
@@ -205,7 +205,7 @@
         <w:widowControl/>
       </w:pPr>
       <w:r>
-        <w:t>Tracked upgrades and configuration work across clinical areas, recording completed units and exceptions for follow-up. Submitted completion records for the located units in the assigned areas. Unlocated equipment, a missing C12 option and access restricted by occupied theatres were recorded for follow-up.</w:t>
+        <w:t>Configuration and software upgrades across assigned clinical areas. Submitted completion records for the located units in the assigned areas. Unlocated equipment, a missing C12 option and access restricted by occupied theatres were recorded for follow-up.</w:t>
       </w:r>
     </w:p>
     <w:p>

</xml_diff>